<commit_message>
Auto commit (2026-10-28 15:52) — 3 changes
Claude Code 세션 종료 시 자동 커밋.

Co-Authored-By: Claude <noreply@anthropic.com>
Claude-Session: https://claude.ai/code/52d1c2c9-8188-4640-b61c-a7aee210702f
</commit_message>
<xml_diff>
--- a/projects/36_slave_dragon_king/노예라 불린 용의 공주_작가 무료회차 수정고(10.27·1-9화)_한국어 번역본(하우스 양식).docx
+++ b/projects/36_slave_dragon_king/노예라 불린 용의 공주_작가 무료회차 수정고(10.27·1-9화)_한국어 번역본(하우스 양식).docx
@@ -1185,7 +1185,7 @@
           <w:color w:val="000000"/>
           <w:sz w:val="21"/>
         </w:rPr>
-        <w:t>용의 울부짖음이 들리고, 하늘 높이 흑룡 여러 마리가 사라를 향해 내리꽂힌다. 【클로즈업】 선두의 흑룡이 거대한 입을 벌린다. 검은 브레스가 막 ( ) 향해 뿜어져 나오려 한다!</w:t>
+        <w:t>용의 울부짖음이 들리고, 하늘 높이 흑룡 여러 마리가 사라를 향해 내리꽂힌다. 【클로즈업】 선두의 흑룡이 거대한 입을 벌린다. 검은 브레스가 막 뿜어져 나오려 한다!</w:t>
       </w:r>
       <w:commentRangeEnd w:id="5"/>
       <w:r>
@@ -14445,7 +14445,7 @@
 
 <file path=word/comments.xml><?xml version="1.0" encoding="utf-8"?>
 <w:comments xmlns:a="http://schemas.openxmlformats.org/drawingml/2006/main" xmlns:pic="http://schemas.openxmlformats.org/drawingml/2006/picture" xmlns:r="http://schemas.openxmlformats.org/officeDocument/2006/relationships" xmlns:w="http://schemas.openxmlformats.org/wordprocessingml/2006/main" xmlns:wp="http://schemas.openxmlformats.org/drawingml/2006/wordprocessingDrawing" xmlns:mc="http://schemas.openxmlformats.org/markup-compatibility/2006" xmlns:a14="http://schemas.microsoft.com/office/drawing/2010/main" xmlns:w14="http://schemas.microsoft.com/office/word/2010/wordml" xmlns:wpc="http://schemas.microsoft.com/office/word/2010/wordprocessingCanvas">
-  <w:comment w:id="0" w:author="검토" w:initials="검" w:date="2026-10-28T06:44:49Z">
+  <w:comment w:id="0" w:author="검토" w:initials="검" w:date="2026-10-28T06:52:37Z">
     <w:p>
       <w:pPr>
         <w:pStyle w:val="CommentText"/>
@@ -14469,7 +14469,7 @@
       </w:r>
     </w:p>
   </w:comment>
-  <w:comment w:id="1" w:author="검토" w:initials="검" w:date="2026-10-28T06:44:49Z">
+  <w:comment w:id="1" w:author="검토" w:initials="검" w:date="2026-10-28T06:52:37Z">
     <w:p>
       <w:pPr>
         <w:pStyle w:val="CommentText"/>
@@ -14493,7 +14493,7 @@
       </w:r>
     </w:p>
   </w:comment>
-  <w:comment w:id="2" w:author="검토" w:initials="검" w:date="2026-10-28T06:44:49Z">
+  <w:comment w:id="2" w:author="검토" w:initials="검" w:date="2026-10-28T06:52:37Z">
     <w:p>
       <w:pPr>
         <w:pStyle w:val="CommentText"/>
@@ -14517,7 +14517,7 @@
       </w:r>
     </w:p>
   </w:comment>
-  <w:comment w:id="3" w:author="검토" w:initials="검" w:date="2026-10-28T06:44:49Z">
+  <w:comment w:id="3" w:author="검토" w:initials="검" w:date="2026-10-28T06:52:37Z">
     <w:p>
       <w:pPr>
         <w:pStyle w:val="CommentText"/>
@@ -14541,7 +14541,7 @@
       </w:r>
     </w:p>
   </w:comment>
-  <w:comment w:id="4" w:author="검토" w:initials="검" w:date="2026-10-28T06:44:49Z">
+  <w:comment w:id="4" w:author="검토" w:initials="검" w:date="2026-10-28T06:52:37Z">
     <w:p>
       <w:pPr>
         <w:pStyle w:val="CommentText"/>
@@ -14565,7 +14565,7 @@
       </w:r>
     </w:p>
   </w:comment>
-  <w:comment w:id="5" w:author="검토" w:initials="검" w:date="2026-10-28T06:44:49Z">
+  <w:comment w:id="5" w:author="검토" w:initials="검" w:date="2026-10-28T06:52:37Z">
     <w:p>
       <w:pPr>
         <w:pStyle w:val="CommentText"/>
@@ -14577,7 +14577,7 @@
         <w:annotationRef/>
       </w:r>
       <w:r>
-        <w:t>[오타] "朝着喷出" 뒤에 향하는 대상이 빠졌어요. 번역도 빈칸으로 남겼어요. (10월 23일에 말씀드린 곳)</w:t>
+        <w:t>원고 오타예요. 「朝着」(~를 향해) 뒤에 대상이 빠져 중문 문장이 끊겼어요. 바로 앞에 흑룡들이 사라를 향해 내리꽂힌다고 나와서 뜻은 통해요. (10월 23일에 말씀드린 곳)</w:t>
       </w:r>
     </w:p>
     <w:p>
@@ -14585,11 +14585,11 @@
         <w:pStyle w:val="CommentText"/>
       </w:pPr>
       <w:r>
-        <w:t>[고칠 줄] 黑色龙息即将朝着莎拉喷出！</w:t>
+        <w:t>고칠 줄: 「黑色龙息即将朝着莎拉喷出！」 또는 「朝着」를 빼서 「黑色龙息即将喷出！」</w:t>
       </w:r>
     </w:p>
   </w:comment>
-  <w:comment w:id="6" w:author="검토" w:initials="검" w:date="2026-10-28T06:44:49Z">
+  <w:comment w:id="6" w:author="검토" w:initials="검" w:date="2026-10-28T06:52:37Z">
     <w:p>
       <w:pPr>
         <w:pStyle w:val="CommentText"/>
@@ -14613,7 +14613,7 @@
       </w:r>
     </w:p>
   </w:comment>
-  <w:comment w:id="7" w:author="검토" w:initials="검" w:date="2026-10-28T06:44:49Z">
+  <w:comment w:id="7" w:author="검토" w:initials="검" w:date="2026-10-28T06:52:37Z">
     <w:p>
       <w:pPr>
         <w:pStyle w:val="CommentText"/>
@@ -14637,7 +14637,7 @@
       </w:r>
     </w:p>
   </w:comment>
-  <w:comment w:id="8" w:author="검토" w:initials="검" w:date="2026-10-28T06:44:49Z">
+  <w:comment w:id="8" w:author="검토" w:initials="검" w:date="2026-10-28T06:52:37Z">
     <w:p>
       <w:pPr>
         <w:pStyle w:val="CommentText"/>
@@ -14661,7 +14661,7 @@
       </w:r>
     </w:p>
   </w:comment>
-  <w:comment w:id="9" w:author="검토" w:initials="검" w:date="2026-10-28T06:44:49Z">
+  <w:comment w:id="9" w:author="검토" w:initials="검" w:date="2026-10-28T06:52:37Z">
     <w:p>
       <w:pPr>
         <w:pStyle w:val="CommentText"/>
@@ -14685,7 +14685,7 @@
       </w:r>
     </w:p>
   </w:comment>
-  <w:comment w:id="10" w:author="검토" w:initials="검" w:date="2026-10-28T06:44:49Z">
+  <w:comment w:id="10" w:author="검토" w:initials="검" w:date="2026-10-28T06:52:37Z">
     <w:p>
       <w:pPr>
         <w:pStyle w:val="CommentText"/>
@@ -14709,7 +14709,7 @@
       </w:r>
     </w:p>
   </w:comment>
-  <w:comment w:id="11" w:author="검토" w:initials="검" w:date="2026-10-28T06:44:49Z">
+  <w:comment w:id="11" w:author="검토" w:initials="검" w:date="2026-10-28T06:52:37Z">
     <w:p>
       <w:pPr>
         <w:pStyle w:val="CommentText"/>
@@ -14733,7 +14733,7 @@
       </w:r>
     </w:p>
   </w:comment>
-  <w:comment w:id="12" w:author="검토" w:initials="검" w:date="2026-10-28T06:44:49Z">
+  <w:comment w:id="12" w:author="검토" w:initials="검" w:date="2026-10-28T06:52:37Z">
     <w:p>
       <w:pPr>
         <w:pStyle w:val="CommentText"/>
@@ -14757,7 +14757,7 @@
       </w:r>
     </w:p>
   </w:comment>
-  <w:comment w:id="13" w:author="검토" w:initials="검" w:date="2026-10-28T06:44:49Z">
+  <w:comment w:id="13" w:author="검토" w:initials="검" w:date="2026-10-28T06:52:37Z">
     <w:p>
       <w:pPr>
         <w:pStyle w:val="CommentText"/>
@@ -14781,7 +14781,7 @@
       </w:r>
     </w:p>
   </w:comment>
-  <w:comment w:id="14" w:author="검토" w:initials="검" w:date="2026-10-28T06:44:49Z">
+  <w:comment w:id="14" w:author="검토" w:initials="검" w:date="2026-10-28T06:52:37Z">
     <w:p>
       <w:pPr>
         <w:pStyle w:val="CommentText"/>
@@ -14805,7 +14805,7 @@
       </w:r>
     </w:p>
   </w:comment>
-  <w:comment w:id="15" w:author="검토" w:initials="검" w:date="2026-10-28T06:44:49Z">
+  <w:comment w:id="15" w:author="검토" w:initials="검" w:date="2026-10-28T06:52:37Z">
     <w:p>
       <w:pPr>
         <w:pStyle w:val="CommentText"/>
@@ -14821,7 +14821,7 @@
       </w:r>
     </w:p>
   </w:comment>
-  <w:comment w:id="16" w:author="검토" w:initials="검" w:date="2026-10-28T06:44:49Z">
+  <w:comment w:id="16" w:author="검토" w:initials="검" w:date="2026-10-28T06:52:37Z">
     <w:p>
       <w:pPr>
         <w:pStyle w:val="CommentText"/>
@@ -14845,7 +14845,7 @@
       </w:r>
     </w:p>
   </w:comment>
-  <w:comment w:id="17" w:author="검토" w:initials="검" w:date="2026-10-28T06:44:49Z">
+  <w:comment w:id="17" w:author="검토" w:initials="검" w:date="2026-10-28T06:52:37Z">
     <w:p>
       <w:pPr>
         <w:pStyle w:val="CommentText"/>
@@ -14869,7 +14869,7 @@
       </w:r>
     </w:p>
   </w:comment>
-  <w:comment w:id="18" w:author="검토" w:initials="검" w:date="2026-10-28T06:44:49Z">
+  <w:comment w:id="18" w:author="검토" w:initials="검" w:date="2026-10-28T06:52:37Z">
     <w:p>
       <w:pPr>
         <w:pStyle w:val="CommentText"/>
@@ -14893,7 +14893,7 @@
       </w:r>
     </w:p>
   </w:comment>
-  <w:comment w:id="19" w:author="검토" w:initials="검" w:date="2026-10-28T06:44:49Z">
+  <w:comment w:id="19" w:author="검토" w:initials="검" w:date="2026-10-28T06:52:37Z">
     <w:p>
       <w:pPr>
         <w:pStyle w:val="CommentText"/>
@@ -14917,7 +14917,7 @@
       </w:r>
     </w:p>
   </w:comment>
-  <w:comment w:id="20" w:author="검토" w:initials="검" w:date="2026-10-28T06:44:49Z">
+  <w:comment w:id="20" w:author="검토" w:initials="검" w:date="2026-10-28T06:52:37Z">
     <w:p>
       <w:pPr>
         <w:pStyle w:val="CommentText"/>
@@ -14941,7 +14941,7 @@
       </w:r>
     </w:p>
   </w:comment>
-  <w:comment w:id="21" w:author="검토" w:initials="검" w:date="2026-10-28T06:44:49Z">
+  <w:comment w:id="21" w:author="검토" w:initials="검" w:date="2026-10-28T06:52:37Z">
     <w:p>
       <w:pPr>
         <w:pStyle w:val="CommentText"/>
@@ -14965,7 +14965,7 @@
       </w:r>
     </w:p>
   </w:comment>
-  <w:comment w:id="22" w:author="검토" w:initials="검" w:date="2026-10-28T06:44:49Z">
+  <w:comment w:id="22" w:author="검토" w:initials="검" w:date="2026-10-28T06:52:37Z">
     <w:p>
       <w:pPr>
         <w:pStyle w:val="CommentText"/>
@@ -14981,7 +14981,7 @@
       </w:r>
     </w:p>
   </w:comment>
-  <w:comment w:id="23" w:author="검토" w:initials="검" w:date="2026-10-28T06:44:49Z">
+  <w:comment w:id="23" w:author="검토" w:initials="검" w:date="2026-10-28T06:52:37Z">
     <w:p>
       <w:pPr>
         <w:pStyle w:val="CommentText"/>
@@ -15005,7 +15005,7 @@
       </w:r>
     </w:p>
   </w:comment>
-  <w:comment w:id="24" w:author="검토" w:initials="검" w:date="2026-10-28T06:44:49Z">
+  <w:comment w:id="24" w:author="검토" w:initials="검" w:date="2026-10-28T06:52:37Z">
     <w:p>
       <w:pPr>
         <w:pStyle w:val="CommentText"/>
@@ -15029,7 +15029,7 @@
       </w:r>
     </w:p>
   </w:comment>
-  <w:comment w:id="25" w:author="검토" w:initials="검" w:date="2026-10-28T06:44:49Z">
+  <w:comment w:id="25" w:author="검토" w:initials="검" w:date="2026-10-28T06:52:37Z">
     <w:p>
       <w:pPr>
         <w:pStyle w:val="CommentText"/>
@@ -15053,7 +15053,7 @@
       </w:r>
     </w:p>
   </w:comment>
-  <w:comment w:id="26" w:author="검토" w:initials="검" w:date="2026-10-28T06:44:49Z">
+  <w:comment w:id="26" w:author="검토" w:initials="검" w:date="2026-10-28T06:52:37Z">
     <w:p>
       <w:pPr>
         <w:pStyle w:val="CommentText"/>
@@ -15077,7 +15077,7 @@
       </w:r>
     </w:p>
   </w:comment>
-  <w:comment w:id="27" w:author="검토" w:initials="검" w:date="2026-10-28T06:44:49Z">
+  <w:comment w:id="27" w:author="검토" w:initials="검" w:date="2026-10-28T06:52:37Z">
     <w:p>
       <w:pPr>
         <w:pStyle w:val="CommentText"/>

</xml_diff>